<commit_message>
Refactor application components and streamline implementation
</commit_message>
<xml_diff>
--- a/output/documents/Huong_dan_van_hanh_KBOT.docx
+++ b/output/documents/Huong_dan_van_hanh_KBOT.docx
@@ -261,7 +261,7 @@
                 <w:rFonts w:ascii="Arial" w:hAnsi="Arial"/>
                 <w:sz w:val="18"/>
               </w:rPr>
-              <w:t>KBOT - Automatic Pick &amp; Place System</w:t>
+              <w:t>KBOT 2.1.1 - Automatic Pick &amp; Place System</w:t>
             </w:r>
           </w:p>
         </w:tc>
@@ -359,17 +359,8 @@
             </w:tcMar>
           </w:tcPr>
           <w:p>
-            <w:pPr>
-              <w:keepLines/>
-              <w:widowControl/>
-              <w:spacing w:after="0"/>
-            </w:pPr>
             <w:r>
-              <w:rPr>
-                <w:rFonts w:ascii="Arial" w:hAnsi="Arial"/>
-                <w:sz w:val="18"/>
-              </w:rPr>
-              <w:t>01</w:t>
+              <w:t>02</w:t>
             </w:r>
           </w:p>
         </w:tc>
@@ -423,7 +414,7 @@
                 <w:rFonts w:ascii="Arial" w:hAnsi="Arial"/>
                 <w:sz w:val="18"/>
               </w:rPr>
-              <w:t>29/07/2026</w:t>
+              <w:t>11/08/2026</w:t>
             </w:r>
           </w:p>
         </w:tc>
@@ -650,17 +641,8 @@
             </w:tcMar>
           </w:tcPr>
           <w:p>
-            <w:pPr>
-              <w:keepLines/>
-              <w:widowControl/>
-              <w:spacing w:after="0"/>
-            </w:pPr>
             <w:r>
-              <w:rPr>
-                <w:rFonts w:ascii="Arial" w:hAnsi="Arial"/>
-                <w:sz w:val="18"/>
-              </w:rPr>
-              <w:t>01</w:t>
+              <w:t>02</w:t>
             </w:r>
           </w:p>
         </w:tc>
@@ -686,7 +668,7 @@
                 <w:rFonts w:ascii="Arial" w:hAnsi="Arial"/>
                 <w:sz w:val="18"/>
               </w:rPr>
-              <w:t>29/07/2026</w:t>
+              <w:t>11/08/2026</w:t>
             </w:r>
           </w:p>
         </w:tc>
@@ -712,7 +694,7 @@
                 <w:rFonts w:ascii="Arial" w:hAnsi="Arial"/>
                 <w:sz w:val="18"/>
               </w:rPr>
-              <w:t>Phát hành hướng dẫn vận hành KBOT</w:t>
+              <w:t>Cập nhật hướng dẫn vận hành cho phần mềm KBOT 2.1.1</w:t>
             </w:r>
           </w:p>
         </w:tc>

</xml_diff>